<commit_message>
Apply suspension screen across alpha grid
</commit_message>
<xml_diff>
--- a/deliverables/문병로_교수의_메트릭_스튜디오_02_01_블로그_게시용_수정본.docx
+++ b/deliverables/문병로_교수의_메트릭_스튜디오_02_01_블로그_게시용_수정본.docx
@@ -1089,7 +1089,7 @@
                 <w:b w:val="0"/>
                 <w:sz w:val="20"/>
               </w:rPr>
-              <w:t>53</w:t>
+              <w:t>110</w:t>
             </w:r>
           </w:p>
         </w:tc>
@@ -1115,7 +1115,7 @@
                 <w:b w:val="0"/>
                 <w:sz w:val="20"/>
               </w:rPr>
-              <w:t>40</w:t>
+              <w:t>42</w:t>
             </w:r>
           </w:p>
         </w:tc>
@@ -1141,7 +1141,7 @@
                 <w:b w:val="0"/>
                 <w:sz w:val="20"/>
               </w:rPr>
-              <w:t>13</w:t>
+              <w:t>68</w:t>
             </w:r>
           </w:p>
         </w:tc>
@@ -1167,7 +1167,7 @@
                 <w:b w:val="0"/>
                 <w:sz w:val="20"/>
               </w:rPr>
-              <w:t>50</w:t>
+              <w:t>91</w:t>
             </w:r>
           </w:p>
         </w:tc>
@@ -1193,7 +1193,7 @@
                 <w:b w:val="0"/>
                 <w:sz w:val="20"/>
               </w:rPr>
-              <w:t>3</w:t>
+              <w:t>19</w:t>
             </w:r>
           </w:p>
         </w:tc>
@@ -1273,7 +1273,7 @@
                 <w:b w:val="0"/>
                 <w:sz w:val="20"/>
               </w:rPr>
-              <w:t>64</w:t>
+              <w:t>127</w:t>
             </w:r>
           </w:p>
         </w:tc>
@@ -1299,7 +1299,7 @@
                 <w:b w:val="0"/>
                 <w:sz w:val="20"/>
               </w:rPr>
-              <w:t>52</w:t>
+              <w:t>55</w:t>
             </w:r>
           </w:p>
         </w:tc>
@@ -1325,7 +1325,7 @@
                 <w:b w:val="0"/>
                 <w:sz w:val="20"/>
               </w:rPr>
-              <w:t>12</w:t>
+              <w:t>72</w:t>
             </w:r>
           </w:p>
         </w:tc>
@@ -1351,7 +1351,7 @@
                 <w:b w:val="0"/>
                 <w:sz w:val="20"/>
               </w:rPr>
-              <w:t>56</w:t>
+              <w:t>95</w:t>
             </w:r>
           </w:p>
         </w:tc>
@@ -1377,7 +1377,7 @@
                 <w:b w:val="0"/>
                 <w:sz w:val="20"/>
               </w:rPr>
-              <w:t>8</w:t>
+              <w:t>32</w:t>
             </w:r>
           </w:p>
         </w:tc>
@@ -1457,7 +1457,7 @@
                 <w:b w:val="0"/>
                 <w:sz w:val="20"/>
               </w:rPr>
-              <w:t>75</w:t>
+              <w:t>142</w:t>
             </w:r>
           </w:p>
         </w:tc>
@@ -1483,7 +1483,7 @@
                 <w:b w:val="0"/>
                 <w:sz w:val="20"/>
               </w:rPr>
-              <w:t>55</w:t>
+              <w:t>59</w:t>
             </w:r>
           </w:p>
         </w:tc>
@@ -1509,7 +1509,7 @@
                 <w:b w:val="0"/>
                 <w:sz w:val="20"/>
               </w:rPr>
-              <w:t>20</w:t>
+              <w:t>83</w:t>
             </w:r>
           </w:p>
         </w:tc>
@@ -1535,7 +1535,7 @@
                 <w:b w:val="0"/>
                 <w:sz w:val="20"/>
               </w:rPr>
-              <w:t>60</w:t>
+              <w:t>98</w:t>
             </w:r>
           </w:p>
         </w:tc>
@@ -1561,7 +1561,7 @@
                 <w:b w:val="0"/>
                 <w:sz w:val="20"/>
               </w:rPr>
-              <w:t>15</w:t>
+              <w:t>42</w:t>
             </w:r>
           </w:p>
         </w:tc>
@@ -1587,7 +1587,7 @@
                 <w:b w:val="0"/>
                 <w:sz w:val="20"/>
               </w:rPr>
-              <w:t>0</w:t>
+              <w:t>2</w:t>
             </w:r>
           </w:p>
         </w:tc>
@@ -1662,7 +1662,7 @@
           <w:rFonts w:ascii="Malgun Gothic" w:hAnsi="Malgun Gothic" w:eastAsia="Malgun Gothic"/>
           <w:sz w:val="22"/>
         </w:rPr>
-        <w:t>참여율을 절반으로 낮춘 2.5%에서도 53개 조합이 남았고, 두 배로 넓힌 10%에서는 75개로 늘었다. 따라서 5%라는 숫자 하나가 안정적인 구간을 만들어 낸 것은 아니다. 동시에 체결 가능성을 더 느슨하게 둘수록 살아남는 조합이 늘어난다는 사실도 분명하다. 유동성 제약은 전략의 참·거짓을 한 번에 판정하는 문턱이 아니라, 운용 가능 범위를 연속적으로 바꾸는 변수다.</w:t>
+        <w:t>참여율을 절반으로 낮춘 2.5%에서도 110개 조합이 남았고, 두 배로 넓힌 10%에서는 142개로 늘었다. 따라서 5%라는 숫자 하나가 안정적인 구간을 만들어 낸 것은 아니다. 동시에 체결 가능성을 더 느슨하게 둘수록 살아남는 조합이 늘어난다는 사실도 분명하다. 유동성 제약은 전략의 참·거짓을 한 번에 판정하는 문턱이 아니라, 운용 가능 범위를 연속적으로 바꾸는 변수다.</w:t>
       </w:r>
     </w:p>
     <w:p>
@@ -1674,7 +1674,7 @@
           <w:rFonts w:ascii="Malgun Gothic" w:hAnsi="Malgun Gothic" w:eastAsia="Malgun Gothic"/>
           <w:sz w:val="22"/>
         </w:rPr>
-        <w:t>세 경우에 공통으로 남지 않은 사실도 있다. 100억 원 운용 규모에서는 안정적인 조합이 하나도 없었다. 참여율을 10%까지 허용해도 이 결과가 바뀌지 않았다는 점은 중요하다. 5% 가정이 지나치게 보수적이어서 100억 원 전략을 지워 버렸다는 설명만으로는 부족하다. 적어도 이 데이터와 월간 주문 방식에서는 운용 규모 자체가 유동성 제약의 중심 변수라는 해석이 더 설득력 있다.</w:t>
+        <w:t>기본 가정인 5%에서는 100억 원 조합이 하나도 남지 않았다. 다만 참여율을 10%로 넓히면 두 조합이 남는다. 따라서 ‘100억 원에서는 절대 불가능하다’는 결론도, ‘5%가 지나치게 보수적이었을 뿐이다’는 결론도 아직 쓸 수 없다. 이 데이터와 월간 주문 방식에서는 운용 규모와 허용 참여율이 함께 결과를 바꾼다고만 적는 편이 정확하다.</w:t>
       </w:r>
     </w:p>
     <w:p>
@@ -1686,7 +1686,7 @@
           <w:rFonts w:ascii="Malgun Gothic" w:hAnsi="Malgun Gothic" w:eastAsia="Malgun Gothic"/>
           <w:sz w:val="22"/>
         </w:rPr>
-        <w:t>그렇다고 10% 참여율에서 75개가 남았으니 실제 주문도 10%까지 받아들여질 것이라고 말할 수는 없다. 이 실험은 호가창을 본 것이 아니라, 어떤 참여율 가정에서 결론이 얼마나 달라지는지 본 것이다. 실제 체결 검증에는 종목별 호가 스프레드, 호가 잔량, 시간대별 거래량, 주문 분할 기록이 추가로 필요하다. 이번 결과가 줄인 것은 가정의 폭이지, 실행 비용의 불확실성 전체가 아니다.</w:t>
+        <w:t>그렇다고 10% 참여율에서 142개가 남았으니 실제 주문도 10%까지 받아들여질 것이라고 말할 수는 없다. 이 실험은 호가창을 본 것이 아니라, 어떤 참여율 가정에서 결론이 얼마나 달라지는지 본 것이다. 실제 체결 검증에는 종목별 호가 스프레드, 호가 잔량, 시간대별 거래량, 주문 분할 기록이 추가로 필요하다. 이번 결과가 줄인 것은 가정의 폭이지, 실행 비용의 불확실성 전체가 아니다.</w:t>
       </w:r>
     </w:p>
     <w:p>
@@ -1952,7 +1952,7 @@
           <w:rFonts w:ascii="Malgun Gothic" w:hAnsi="Malgun Gothic" w:eastAsia="Malgun Gothic"/>
           <w:sz w:val="22"/>
         </w:rPr>
-        <w:t>두 번째 그래프는 그 조합이 어느 유동성 범위에 있었는지 보여 준다. 1개월 반전과 6개월 모멘텀은 통과 조합이 없었다. 저변동성은 유동성 상위 60~90%에서, 소형주는 상위 80~90%에서만 남았다. 같은 유동성 조건도 어떤 신호와 결합하느냐에 따라 전혀 다른 제약이 된다. 그래서 이 실험의 결론은 ‘80%를 쓰라’가 아니라, 유동성 기준을 전략 밖의 고정 필터처럼 두면 안 된다는 쪽에 가깝다.</w:t>
+        <w:t>두 번째 그래프는 그 조합이 어느 유동성 범위에 있었는지 보여 준다. 1개월 반전과 6개월 모멘텀은 통과 조합이 없었다. 저변동성은 유동성 상위 60~90%에서, 소형주는 상위 50~90%에서 남았다. 거래정지구분을 선택 시점에 반영하자 소형주의 범위가 달라졌다. 같은 유동성 조건도 어떤 신호와 결합하느냐에 따라 전혀 다른 제약이 된다. 그래서 이 실험의 결론은 ‘80%를 쓰라’가 아니라, 유동성 기준을 전략 밖의 고정 필터처럼 두면 안 된다는 쪽에 가깝다.</w:t>
       </w:r>
     </w:p>
     <w:p>
@@ -1972,7 +1972,7 @@
           <w:rFonts w:ascii="Malgun Gothic" w:hAnsi="Malgun Gothic" w:eastAsia="Malgun Gothic"/>
           <w:sz w:val="22"/>
         </w:rPr>
-        <w:t>조건을 모두 통과한 전략은 64개였다. 그중 52개는 저변동성 신호 주변에 연결돼 있었다. 시장충격을 두 배로 올려도, 운용 규모 1억~10억 원 범위에서는 이 영역이 남았다. 저변동성이 가장 높은 수익률을 냈다는 뜻은 아니다. 현실 가정을 조금 바꿔도 결과가 급격히 사라지지 않았다는 뜻이다.</w:t>
+        <w:t>조건을 모두 통과한 전략은 127개였다. 그중 72개는 소형주, 55개는 저변동성 신호 주변에 연결돼 있었다. 시장충격을 두 배로 올려도, 운용 규모 1억~10억 원 범위에서는 이 두 영역이 남았다. 어느 쪽이 가장 높은 수익률을 냈다는 뜻이 아니라, 현실 가정을 조금 바꿔도 결과가 곧바로 사라지지 않았다는 뜻이다.</w:t>
       </w:r>
     </w:p>
     <w:p>
@@ -1984,7 +1984,7 @@
           <w:rFonts w:ascii="Malgun Gothic" w:hAnsi="Malgun Gothic" w:eastAsia="Malgun Gothic"/>
           <w:sz w:val="22"/>
         </w:rPr>
-        <w:t>64개라는 숫자는 1,728개 가운데 3.7%다. 대부분의 조합은 어느 한 단계에서 탈락했다. 이 비율을 보고 ‘좋은 전략이 드물다’고 결론 내릴 수는 없다. 내가 네 개의 기준을 동시에 걸었기 때문에 당연히 통과 집합은 작아진다. 다만 이 결과는 높은 CAGR 하나를 찾는 것과, 여러 현실 제약 아래에서 동시에 살아남는 조합을 찾는 일이 전혀 다르다는 점을 보여 준다.</w:t>
+        <w:t>127개는 1,728개 가운데 7.3%다. 대부분의 조합은 어느 한 단계에서 탈락했다. 이 비율을 보고 ‘좋은 전략이 드물다’고 결론 내릴 수는 없다. 내가 네 개의 기준을 동시에 걸었기 때문에 통과 집합이 작아지는 것은 자연스럽다. 다만 높은 CAGR 하나를 찾는 일과, 여러 현실 제약 아래에서 동시에 살아남는 조합을 찾는 일이 다르다는 점은 더 선명해졌다.</w:t>
       </w:r>
     </w:p>
     <w:p>
@@ -1996,7 +1996,7 @@
           <w:rFonts w:ascii="Malgun Gothic" w:hAnsi="Malgun Gothic" w:eastAsia="Malgun Gothic"/>
           <w:sz w:val="22"/>
         </w:rPr>
-        <w:t>저변동성의 52개는 유동성 상위 60%에서 90% 사이에 분포했다. 상위 60%에서 12개, 70%에서 16개, 80%에서 14개, 90%에서 10개가 남았다. 책에서 강조한 80%는 이 실험에서도 비어 있지 않았지만, 유일한 답은 아니었다. 오히려 70%와 80% 사이에서 여러 조합이 동시에 남았다는 사실이 더 중요하다. 이 결과는 ‘80%를 쓰라’가 아니라, 이 표본과 이 비용 모형에서는 60~90% 부근을 하나의 후보 영역으로 다시 점검해야 한다는 뜻이다.</w:t>
+        <w:t>저변동성의 55개는 유동성 상위 60%에서 90% 사이에 분포했다. 상위 60%에서 14개, 70%에서 17개, 80%에서 14개, 90%에서 10개가 남았다. 책에서 강조한 80%는 이 실험에서도 비어 있지 않았지만 유일한 답은 아니었다. 이 표본과 이 비용 모형에서는 60~90% 부근이 하나의 후보 영역으로 남았다.</w:t>
       </w:r>
     </w:p>
     <w:p>
@@ -2008,7 +2008,7 @@
           <w:rFonts w:ascii="Malgun Gothic" w:hAnsi="Malgun Gothic" w:eastAsia="Malgun Gothic"/>
           <w:sz w:val="22"/>
         </w:rPr>
-        <w:t>소형주의 12개는 상위 80%에 8개, 상위 90%에 4개가 남았다. 상위 50% 이하에서 소형주 안정적인 구간이 없었다는 사실은 단순하다. 유동성이 높은 종목만 남기면 소형주 신호가 찾으려는 규모 특성 자체가 많이 사라진다. 반대로 전체 시장까지 넓히면 체결률과 비용 조건에서 탈락한다. 소형주에 필요한 유동성 범위가 저변동성과 다르게 나타난다는 점이, 유동성 컷을 전략 바깥의 공통 필터로 둘 수 없는 이유다.</w:t>
+        <w:t>소형주는 더 넓게 퍼졌다. 유동성 상위 50%에서 4개, 60%에서 24개, 70%에서 16개, 80%에서 16개, 90%에서 12개가 남았다. 거래정지 상태를 선택 시점에 제외한 뒤에도 소형주가 상위 80~90%에서만 남는다는 기존 해석은 유지되지 않았다. 이 변화가 바로 거래정지 패널을 전체 실험에 넣어야 했던 이유다.</w:t>
       </w:r>
     </w:p>
     <w:p>
@@ -2020,7 +2020,7 @@
           <w:rFonts w:ascii="Malgun Gothic" w:hAnsi="Malgun Gothic" w:eastAsia="Malgun Gothic"/>
           <w:sz w:val="22"/>
         </w:rPr>
-        <w:t>운용 규모를 보면 더 선명해진다. 저변동성 52개 가운데 48개는 1억 원, 4개는 10억 원 조건에 속했다. 소형주 12개도 1억 원이 8개, 10억 원이 4개였다. 100억 원 조건에서는 네 신호 모두 안정적인 구간이 남지 않았다. 이것은 100억 원으로 한국 주식 전략을 운용할 수 없다는 선언이 아니다. 이 실험의 월간 리밸런싱·동일가중·종목당 21일 평균 거래대금의 5%라는 가정 아래에서는, 같은 포트폴리오를 100억 원 규모로 늘렸을 때 네 기준을 동시에 지키지 못했다는 뜻이다.</w:t>
+        <w:t>운용 규모를 보면 저변동성 55개 가운데 51개는 1억 원, 4개는 10억 원 조건에 속했다. 소형주 72개는 1억 원이 44개, 10억 원이 28개였다. 기본 참여율 5%에서는 100억 원 조합이 남지 않았다. 이것은 100억 원으로 한국 주식 전략을 운용할 수 없다는 선언이 아니라, 이 월간 리밸런싱·동일가중·참여율 가정 아래에서는 같은 포트폴리오를 그 규모로 늘렸을 때 네 기준을 함께 지키지 못했다는 뜻이다.</w:t>
       </w:r>
     </w:p>
     <w:p>
@@ -2044,7 +2044,7 @@
           <w:rFonts w:ascii="Malgun Gothic" w:hAnsi="Malgun Gothic" w:eastAsia="Malgun Gothic"/>
           <w:sz w:val="22"/>
         </w:rPr>
-        <w:t>소형주는 다른 모습이었다. 연결된 조합은 12개로 작았지만, 일부 조합은 강한 수익률을 냈다. 소형주 50종목, 유동성 상위 90%, 운용 규모 1억 원, 비용 0.5배라는 조합의 비용 차감 CAGR은 38.6%, t-통계량은 5.92였다. 평균 체결률도 97.6%였다.</w:t>
+        <w:t>소형주는 다른 모습이었다. 연결된 조합이 72개로 넓게 남았지만, 그중에서도 가장 높은 t-통계량을 보인 것은 소형주 50종목, 유동성 상위 90%, 운용 규모 1억 원, 비용 0.5배 조합이었다. 비용 차감 CAGR은 47.8%, t-통계량은 6.86, 평균 체결률은 97.4%였다.</w:t>
       </w:r>
     </w:p>
     <w:p>
@@ -2056,7 +2056,7 @@
           <w:rFonts w:ascii="Malgun Gothic" w:hAnsi="Malgun Gothic" w:eastAsia="Malgun Gothic"/>
           <w:sz w:val="22"/>
         </w:rPr>
-        <w:t>이 조합을 대표 전략이라고 부르지 않은 이유도 분명하다. 비용 0.5배는 네 비용 가정 중 가장 낮은 쪽이다. 성과가 크다는 사실은 이 조합이 가장 현실적이라는 뜻이 아니라, 비용 가정에 특히 민감할 수 있다는 경고다. 실제로 소형주 안정적인 구간은 비용 0.5·1.0·1.5·2.0배에 각각 3개씩만 남았다. 비용을 두 배로 올려도 완전히 사라지지는 않았지만, 이 숫자는 소형주가 저변동성보다 훨씬 좁은 실행 조건을 갖는다는 것을 보여 준다.</w:t>
+        <w:t>이 조합을 대표 전략이라고 부르지 않은 이유도 분명하다. 비용 0.5배는 네 비용 가정 중 가장 낮은 쪽이다. 성과가 크다는 사실은 이 조합이 가장 현실적이라는 뜻이 아니라, 비용 가정에 특히 민감할 수 있다는 경고다. 다만 이번 재계산에서는 소형주 조합이 비용 0.5·1.0·1.5·2.0배를 바꾼 뒤에도 넓게 남았다. 이 결과를 비용이 중요하지 않다는 뜻으로 읽어서는 안 된다. 현재 비용 모형이 호가 자료가 아닌 거래대금 기반 가정이라는 한계는 그대로다.</w:t>
       </w:r>
     </w:p>
     <w:p>
@@ -2097,261 +2097,10 @@
     </w:p>
     <w:p>
       <w:pPr>
-        <w:spacing w:after="160" w:line="320" w:lineRule="auto"/>
+        <w:pStyle w:val="Heading2"/>
       </w:pPr>
       <w:r>
-        <w:rPr>
-          <w:rFonts w:ascii="Malgun Gothic" w:hAnsi="Malgun Gothic" w:eastAsia="Malgun Gothic"/>
-          <w:sz w:val="22"/>
-        </w:rPr>
-        <w:t>한 번 더 시간으로 표본을 나눴다. 2000년 8월부터 2013년 12월까지에서 가장 높은 t-통계량을 낸 조합을 고르고, 2014년 1월 이후 149개월은 선택에 전혀 사용하지 않았다. 학습 구간에서 선택된 조합은 동일하게 소형주 50종목·유동성 상위 90%·1억 원·비용 0.5배였고, 이후 기간의 t-통계량은 5.54, 비용 차감 CAGR은 43.9%였다.</w:t>
-      </w:r>
-    </w:p>
-    <w:tbl>
-      <w:tblPr>
-        <w:tblW w:type="auto" w:w="0"/>
-        <w:jc w:val="center"/>
-        <w:tblLayout w:type="fixed"/>
-        <w:tblLook w:firstColumn="1" w:firstRow="1" w:lastColumn="0" w:lastRow="0" w:noHBand="0" w:noVBand="1" w:val="04A0"/>
-      </w:tblPr>
-      <w:tblGrid>
-        <w:gridCol w:w="2340"/>
-        <w:gridCol w:w="2340"/>
-        <w:gridCol w:w="2340"/>
-        <w:gridCol w:w="2340"/>
-      </w:tblGrid>
-      <w:tr>
-        <w:tc>
-          <w:tcPr>
-            <w:tcW w:type="dxa" w:w="1800"/>
-            <w:tcMar>
-              <w:top w:w="80" w:type="dxa"/>
-              <w:start w:w="120" w:type="dxa"/>
-              <w:bottom w:w="80" w:type="dxa"/>
-              <w:end w:w="120" w:type="dxa"/>
-            </w:tcMar>
-            <w:vAlign w:val="center"/>
-            <w:shd w:fill="F2F4F7"/>
-          </w:tcPr>
-          <w:p>
-            <w:pPr>
-              <w:spacing w:after="0"/>
-              <w:jc w:val="left"/>
-            </w:pPr>
-            <w:r>
-              <w:rPr>
-                <w:rFonts w:ascii="Malgun Gothic" w:hAnsi="Malgun Gothic" w:eastAsia="Malgun Gothic"/>
-                <w:b/>
-                <w:sz w:val="20"/>
-              </w:rPr>
-              <w:t>선택 구간</w:t>
-            </w:r>
-          </w:p>
-        </w:tc>
-        <w:tc>
-          <w:tcPr>
-            <w:tcW w:type="dxa" w:w="1008"/>
-            <w:tcMar>
-              <w:top w:w="80" w:type="dxa"/>
-              <w:start w:w="120" w:type="dxa"/>
-              <w:bottom w:w="80" w:type="dxa"/>
-              <w:end w:w="120" w:type="dxa"/>
-            </w:tcMar>
-            <w:vAlign w:val="center"/>
-            <w:shd w:fill="F2F4F7"/>
-          </w:tcPr>
-          <w:p>
-            <w:pPr>
-              <w:spacing w:after="0"/>
-              <w:jc w:val="center"/>
-            </w:pPr>
-            <w:r>
-              <w:rPr>
-                <w:rFonts w:ascii="Malgun Gothic" w:hAnsi="Malgun Gothic" w:eastAsia="Malgun Gothic"/>
-                <w:b/>
-                <w:sz w:val="20"/>
-              </w:rPr>
-              <w:t>검증 구간</w:t>
-            </w:r>
-          </w:p>
-        </w:tc>
-        <w:tc>
-          <w:tcPr>
-            <w:tcW w:type="dxa" w:w="2880"/>
-            <w:tcMar>
-              <w:top w:w="80" w:type="dxa"/>
-              <w:start w:w="120" w:type="dxa"/>
-              <w:bottom w:w="80" w:type="dxa"/>
-              <w:end w:w="120" w:type="dxa"/>
-            </w:tcMar>
-            <w:vAlign w:val="center"/>
-            <w:shd w:fill="F2F4F7"/>
-          </w:tcPr>
-          <w:p>
-            <w:pPr>
-              <w:spacing w:after="0"/>
-              <w:jc w:val="center"/>
-            </w:pPr>
-            <w:r>
-              <w:rPr>
-                <w:rFonts w:ascii="Malgun Gothic" w:hAnsi="Malgun Gothic" w:eastAsia="Malgun Gothic"/>
-                <w:b/>
-                <w:sz w:val="20"/>
-              </w:rPr>
-              <w:t>검증 t-통계량</w:t>
-            </w:r>
-          </w:p>
-        </w:tc>
-        <w:tc>
-          <w:tcPr>
-            <w:tcW w:type="dxa" w:w="3096"/>
-            <w:tcMar>
-              <w:top w:w="80" w:type="dxa"/>
-              <w:start w:w="120" w:type="dxa"/>
-              <w:bottom w:w="80" w:type="dxa"/>
-              <w:end w:w="120" w:type="dxa"/>
-            </w:tcMar>
-            <w:vAlign w:val="center"/>
-            <w:shd w:fill="F2F4F7"/>
-          </w:tcPr>
-          <w:p>
-            <w:pPr>
-              <w:spacing w:after="0"/>
-              <w:jc w:val="center"/>
-            </w:pPr>
-            <w:r>
-              <w:rPr>
-                <w:rFonts w:ascii="Malgun Gothic" w:hAnsi="Malgun Gothic" w:eastAsia="Malgun Gothic"/>
-                <w:b/>
-                <w:sz w:val="20"/>
-              </w:rPr>
-              <w:t>검증 CAGR</w:t>
-            </w:r>
-          </w:p>
-        </w:tc>
-      </w:tr>
-      <w:tr>
-        <w:tc>
-          <w:tcPr>
-            <w:tcW w:type="dxa" w:w="1800"/>
-            <w:tcMar>
-              <w:top w:w="80" w:type="dxa"/>
-              <w:start w:w="120" w:type="dxa"/>
-              <w:bottom w:w="80" w:type="dxa"/>
-              <w:end w:w="120" w:type="dxa"/>
-            </w:tcMar>
-            <w:vAlign w:val="center"/>
-          </w:tcPr>
-          <w:p>
-            <w:pPr>
-              <w:spacing w:after="0"/>
-              <w:jc w:val="left"/>
-            </w:pPr>
-            <w:r>
-              <w:rPr>
-                <w:rFonts w:ascii="Malgun Gothic" w:hAnsi="Malgun Gothic" w:eastAsia="Malgun Gothic"/>
-                <w:b w:val="0"/>
-                <w:sz w:val="20"/>
-              </w:rPr>
-              <w:t>2000.08~2013.12</w:t>
-            </w:r>
-          </w:p>
-        </w:tc>
-        <w:tc>
-          <w:tcPr>
-            <w:tcW w:type="dxa" w:w="1008"/>
-            <w:tcMar>
-              <w:top w:w="80" w:type="dxa"/>
-              <w:start w:w="120" w:type="dxa"/>
-              <w:bottom w:w="80" w:type="dxa"/>
-              <w:end w:w="120" w:type="dxa"/>
-            </w:tcMar>
-            <w:vAlign w:val="center"/>
-          </w:tcPr>
-          <w:p>
-            <w:pPr>
-              <w:spacing w:after="0"/>
-              <w:jc w:val="center"/>
-            </w:pPr>
-            <w:r>
-              <w:rPr>
-                <w:rFonts w:ascii="Malgun Gothic" w:hAnsi="Malgun Gothic" w:eastAsia="Malgun Gothic"/>
-                <w:b w:val="0"/>
-                <w:sz w:val="20"/>
-              </w:rPr>
-              <w:t>2014.01~2026.05</w:t>
-            </w:r>
-          </w:p>
-        </w:tc>
-        <w:tc>
-          <w:tcPr>
-            <w:tcW w:type="dxa" w:w="2880"/>
-            <w:tcMar>
-              <w:top w:w="80" w:type="dxa"/>
-              <w:start w:w="120" w:type="dxa"/>
-              <w:bottom w:w="80" w:type="dxa"/>
-              <w:end w:w="120" w:type="dxa"/>
-            </w:tcMar>
-            <w:vAlign w:val="center"/>
-          </w:tcPr>
-          <w:p>
-            <w:pPr>
-              <w:spacing w:after="0"/>
-              <w:jc w:val="center"/>
-            </w:pPr>
-            <w:r>
-              <w:rPr>
-                <w:rFonts w:ascii="Malgun Gothic" w:hAnsi="Malgun Gothic" w:eastAsia="Malgun Gothic"/>
-                <w:b w:val="0"/>
-                <w:sz w:val="20"/>
-              </w:rPr>
-              <w:t>5.54</w:t>
-            </w:r>
-          </w:p>
-        </w:tc>
-        <w:tc>
-          <w:tcPr>
-            <w:tcW w:type="dxa" w:w="3096"/>
-            <w:tcMar>
-              <w:top w:w="80" w:type="dxa"/>
-              <w:start w:w="120" w:type="dxa"/>
-              <w:bottom w:w="80" w:type="dxa"/>
-              <w:end w:w="120" w:type="dxa"/>
-            </w:tcMar>
-            <w:vAlign w:val="center"/>
-          </w:tcPr>
-          <w:p>
-            <w:pPr>
-              <w:spacing w:after="0"/>
-              <w:jc w:val="center"/>
-            </w:pPr>
-            <w:r>
-              <w:rPr>
-                <w:rFonts w:ascii="Malgun Gothic" w:hAnsi="Malgun Gothic" w:eastAsia="Malgun Gothic"/>
-                <w:b w:val="0"/>
-                <w:sz w:val="20"/>
-              </w:rPr>
-              <w:t>43.9%</w:t>
-            </w:r>
-          </w:p>
-        </w:tc>
-      </w:tr>
-    </w:tbl>
-    <w:p>
-      <w:pPr>
-        <w:spacing w:after="0"/>
-      </w:pPr>
-    </w:p>
-    <w:p>
-      <w:pPr>
-        <w:spacing w:after="160" w:line="320" w:lineRule="auto"/>
-      </w:pPr>
-      <w:r>
-        <w:rPr>
-          <w:rFonts w:ascii="Malgun Gothic" w:hAnsi="Malgun Gothic" w:eastAsia="Malgun Gothic"/>
-          <w:sz w:val="22"/>
-        </w:rPr>
-        <w:t>한 번의 분할에 의존하지 않기 위해 2008년부터 매년 같은 절차를 반복했다. 매년 1월에는 그 전까지의 데이터로 t-통계량이 가장 높은 조합 하나만 고르고, 그해 12개월 수익률로만 평가했다. 19년·221개월의 롤링 워크포워드 CAGR은 30.4%, t-통계량은 4.74였다. 19번의 선택에서 같은 소형주 조합이 계속 선택됐다.</w:t>
+        <w:t>거래정지구분 파일을 전체 실험에 넣고 다시 계산했다</w:t>
       </w:r>
     </w:p>
     <w:p>
@@ -2363,7 +2112,7 @@
           <w:rFonts w:ascii="Malgun Gothic" w:hAnsi="Malgun Gothic" w:eastAsia="Malgun Gothic"/>
           <w:sz w:val="22"/>
         </w:rPr>
-        <w:t>워크포워드 결과도 ‘2014년 이후에 잘 맞았으니 미래에도 맞는다’는 보증은 아니다. 이 절차가 막는 것은 검증 구간의 수익률을 미리 본 뒤 전략을 고르는 행동이다. 반면 한 번 정한 신호의 정의, 월말 체결이라는 시간 단위, 5% 참여율, 시장충격 함수는 여전히 연구자가 선택한 가정이다. 검증이 많을수록 가정이 사라지는 것이 아니라, 어떤 가정에 결과가 민감한지가 더 또렷해질 뿐이다.</w:t>
+        <w:t>여기에서 기존 원고의 오류가 드러났다. 거래정지구분 파일은 있었지만, 처음의 1,728개 조합에는 들어가 있지 않았다. 별도 소형주 점검에서만 한 번 확인하고, 전체 실험에 반영한 것처럼 쓴 것이다. 그래서 그 결과와 그 결과를 바탕으로 한 워크포워드·지연집행·벤치마크 수치는 모두 이번 글에서 뺐다. 거래정지 필터를 통합한 뒤에는 그 검증들도 처음부터 다시 해야 한다.</w:t>
       </w:r>
     </w:p>
     <w:p>
@@ -2375,15 +2124,7 @@
           <w:rFonts w:ascii="Malgun Gothic" w:hAnsi="Malgun Gothic" w:eastAsia="Malgun Gothic"/>
           <w:sz w:val="22"/>
         </w:rPr>
-        <w:t>여기서 기간 표기를 분리할 필요가 있다. 신호를 만드는 수정주가·거래량·시가총액 패널의 마지막 월은 2026년 4월이다. 표의 검증 종료가 2026년 5월인 이유는 2026년 4월에 선택한 종목의 한 달 뒤 수익률을 관측했기 때문이다. 입력 데이터의 마지막 월과 평가 수익률의 마지막 월을 같은 뜻으로 쓰면 안 된다.</w:t>
-      </w:r>
-    </w:p>
-    <w:p>
-      <w:pPr>
-        <w:pStyle w:val="Heading2"/>
-      </w:pPr>
-      <w:r>
-        <w:t>거래정지와 종료 종목을 다시 확인한 이유</w:t>
+        <w:t>이번 재계산에서는 DataGuide의 거래정지구분에서 선택 시점 상태가 ‘정상’이 아닌 행 13,385건, 종목 1,908개를 후보군에서 제외했다. 원천 가격 데이터에 과거 상장폐지 종목이 들어 있다는 사실과는 다른 처리다. 각 월에 이미 거래할 수 없는 종목은 후보에서 빼고, 나중에 상장폐지된다는 미래 정보로 과거의 종목을 미리 지우지는 않았다.</w:t>
       </w:r>
     </w:p>
     <w:p>
@@ -2395,127 +2136,7 @@
           <w:rFonts w:ascii="Malgun Gothic" w:hAnsi="Malgun Gothic" w:eastAsia="Malgun Gothic"/>
           <w:sz w:val="22"/>
         </w:rPr>
-        <w:t>이 결과는 최고점을 고른 뒤 같은 기간에서 다시 칭찬한 것은 아니라는 점을 보여준다. 다음으로 원시 DataGuide 거래정지구분 패널을 직접 연결했다. 선택 시점에 상태가 ‘정상’이 아닌 종목 1,908개를 제외한 뒤, 같은 소형주 전략을 다시 실행했다.</w:t>
-      </w:r>
-    </w:p>
-    <w:p>
-      <w:pPr>
-        <w:spacing w:after="160" w:line="320" w:lineRule="auto"/>
-      </w:pPr>
-      <w:r>
-        <w:rPr>
-          <w:rFonts w:ascii="Malgun Gothic" w:hAnsi="Malgun Gothic" w:eastAsia="Malgun Gothic"/>
-          <w:sz w:val="22"/>
-        </w:rPr>
-        <w:t>거래정지 보정 뒤 비용 차감 CAGR은 46.6%, t-통계량은 6.55, MDD는 -44.6%였다. 보정 전 동일 기간의 CAGR 38.7%, t-통계량 5.79, MDD -49.1%보다 나쁘지 않았다. 적어도 이 전략의 결과가 거래정지 종목을 그대로 포함했기 때문에 생긴 것은 아니라는 점은 확인했다.</w:t>
-      </w:r>
-    </w:p>
-    <w:p>
-      <w:pPr>
-        <w:spacing w:after="160" w:line="320" w:lineRule="auto"/>
-      </w:pPr>
-      <w:r>
-        <w:rPr>
-          <w:rFonts w:ascii="Malgun Gothic" w:hAnsi="Malgun Gothic" w:eastAsia="Malgun Gothic"/>
-          <w:sz w:val="22"/>
-        </w:rPr>
-        <w:t>이 보정 결과가 오히려 좋아졌다고 해서 거래정지 종목을 빼면 전략이 좋아진다고 일반화할 수는 없다. 거래정지 상태의 종목은 이미 포트폴리오에서 낮은 비중이었을 수도 있고, 제외 뒤에 남은 종목의 비중이 달라졌을 수도 있다. 여기서 가능한 결론은 하나뿐이다. 거래정지 플래그를 선택 시점에 반영해도 핵심 결과가 즉시 사라지지 않았다는 것. 보정 전후의 수익률 차이에 경제적 설명을 붙이는 일은 별도 분석이 필요하다.</w:t>
-      </w:r>
-    </w:p>
-    <w:p>
-      <w:pPr>
-        <w:spacing w:after="160" w:line="320" w:lineRule="auto"/>
-      </w:pPr>
-      <w:r>
-        <w:rPr>
-          <w:rFonts w:ascii="Malgun Gothic" w:hAnsi="Malgun Gothic" w:eastAsia="Malgun Gothic"/>
-          <w:sz w:val="22"/>
-        </w:rPr>
-        <w:t>원천 데이터에는 상장폐지 이력이 있는 종목도 포함돼 있다. 다만 매월 포트폴리오 후보군은 그 선택 시점에 수정주가·거래대금·시가총액이 관측되고 거래정지 상태가 아닌 종목으로만 만들었다. 이미 거래할 수 없는 종목은 그 달 후보가 될 수 없다. 반대로 나중에 상장폐지된다는 사실을 알고 과거의 후보군에서 미리 지우지도 않았다. 그렇게 하면 당시에는 아직 거래 가능했던 종목을 미래 정보를 이용해 제거하게 되기 때문이다.</w:t>
-      </w:r>
-    </w:p>
-    <w:p>
-      <w:pPr>
-        <w:spacing w:after="160" w:line="320" w:lineRule="auto"/>
-      </w:pPr>
-      <w:r>
-        <w:rPr>
-          <w:rFonts w:ascii="Malgun Gothic" w:hAnsi="Malgun Gothic" w:eastAsia="Malgun Gothic"/>
-          <w:sz w:val="22"/>
-        </w:rPr>
-        <w:t>수익률 연결도 다시 감사했다. 기존 월간 패널에는 다음 달이 아니라 몇 년 뒤 재관측된 가격을 연결할 수 있는 공백이 21개 있었다. 최대 공백은 6,394일이었다. 19개 코드의 재진입 구간 1,764행을 격리하고, 1·6·12개월 수익률은 달력상 정확히 해당 기간 뒤의 관측치가 있을 때만 계산했다. 이 보정 뒤에도 소형주 신호에서 안정적인 구간에 속한 조합 12개는 남았고, 저변동성 신호의 해당 조합 수는 55개에서 52개로 줄었다.</w:t>
-      </w:r>
-    </w:p>
-    <w:p>
-      <w:pPr>
-        <w:spacing w:after="160" w:line="320" w:lineRule="auto"/>
-      </w:pPr>
-      <w:r>
-        <w:rPr>
-          <w:rFonts w:ascii="Malgun Gothic" w:hAnsi="Malgun Gothic" w:eastAsia="Malgun Gothic"/>
-          <w:sz w:val="22"/>
-        </w:rPr>
-        <w:t>이 부분은 숫자가 커서가 아니라 오류의 방향을 알 수 없어서 위험하다. 몇 년 뒤의 가격을 다음 달 가격으로 잘못 연결하면, 실제로는 거래할 수 없던 공백 기간의 손익이 한 번의 월 수익률에 섞인다. 그 결과는 과대수익일 수도, 과소수익일 수도 있다. 중요한 것은 발견한 뒤 제거했다는 사실보다, 수정 전 결과가 얼마나 많은 연결 규칙에 의존하고 있었는지를 기록하는 일이다. 백테스트의 오류는 종종 수익률을 부풀리는 단순한 형태가 아니라, 시간의 순서를 뒤섞는 형태로 나타난다.</w:t>
-      </w:r>
-    </w:p>
-    <w:p>
-      <w:pPr>
-        <w:spacing w:after="160" w:line="320" w:lineRule="auto"/>
-      </w:pPr>
-      <w:r>
-        <w:rPr>
-          <w:rFonts w:ascii="Malgun Gothic" w:hAnsi="Malgun Gothic" w:eastAsia="Malgun Gothic"/>
-          <w:sz w:val="22"/>
-        </w:rPr>
-        <w:t>이 중립 규칙 아래 소형주 전략의 CAGR은 38.7%다. 한 달 늦게 집행해도 CAGR 28.4%, t-통계량 4.82가 남았다. 추가 편도비용을 점차 얹으면 약 141bp에서 CAGR이 0이 된다. 지금의 비용 모형이 무조건 낙관적이라는 비판은 이 숫자와 실제 호가 스프레드를 비교해 판정할 수 있다.</w:t>
-      </w:r>
-    </w:p>
-    <w:p>
-      <w:pPr>
-        <w:spacing w:after="160" w:line="320" w:lineRule="auto"/>
-      </w:pPr>
-      <w:r>
-        <w:rPr>
-          <w:rFonts w:ascii="Malgun Gothic" w:hAnsi="Malgun Gothic" w:eastAsia="Malgun Gothic"/>
-          <w:sz w:val="22"/>
-        </w:rPr>
-        <w:t>비용을 매월 전량 교체한다고 둔 가정도 풀어 보았다. 실제 전월 보유 종목의 가격 변동 뒤 목표 비중으로 되돌리는 교체율은 평균 38.2%였다. 같은 비용 함수를 실제 교체율에만 적용하면 CAGR은 41.1%가 된다. 이 수치는 전략이 더 좋아졌다는 발견이 아니다. 전량 월간 매매는 비용을 보수적으로 과대 계상했다는 뜻이다.</w:t>
-      </w:r>
-    </w:p>
-    <w:p>
-      <w:pPr>
-        <w:spacing w:after="160" w:line="320" w:lineRule="auto"/>
-      </w:pPr>
-      <w:r>
-        <w:rPr>
-          <w:rFonts w:ascii="Malgun Gothic" w:hAnsi="Malgun Gothic" w:eastAsia="Malgun Gothic"/>
-          <w:sz w:val="22"/>
-        </w:rPr>
-        <w:t>하지만 실제 교체율 38.2%도 자동매매의 실현 비용과 같지 않다. 종목이 바뀌지 않아도 가격이 급변한 날에는 리밸런싱 주문이 한쪽으로 몰릴 수 있고, 월말 종가 기준의 신호와 실제 주문 시간 사이에는 갭이 있다. 이 계산은 ‘전량 교체’라는 단순화가 어느 방향으로 비용을 왜곡하는지만 확인한다. 호가 스프레드, 주문 분할, 장중 거래량 분포가 없는 현재 데이터로는 비용의 정확한 추정치를 만들 수 없다.</w:t>
-      </w:r>
-    </w:p>
-    <w:p>
-      <w:pPr>
-        <w:spacing w:after="160" w:line="320" w:lineRule="auto"/>
-      </w:pPr>
-      <w:r>
-        <w:rPr>
-          <w:rFonts w:ascii="Malgun Gothic" w:hAnsi="Malgun Gothic" w:eastAsia="Malgun Gothic"/>
-          <w:sz w:val="22"/>
-        </w:rPr>
-        <w:t>그렇다고 41.1%를 알파라고 부를 수는 없다. 같은 유동성 상위 90% 유니버스를 동일가중한 벤치마크의 CAGR은 8.7%였고, 상대 CAGR은 29.8%였다. 월별 회귀에서 벤치마크 베타는 0.83, 절편은 월 2.54%였으며 절편 t-통계량은 6.04였다. 적어도 결과가 넓은 유동성 시장을 단순히 많이 산 효과만은 아니라는 반증이다. 규모 외의 위험요인을 통제한 완전한 요인 알파와는 다른 주장이다.</w:t>
-      </w:r>
-    </w:p>
-    <w:p>
-      <w:pPr>
-        <w:spacing w:after="160" w:line="320" w:lineRule="auto"/>
-      </w:pPr>
-      <w:r>
-        <w:rPr>
-          <w:rFonts w:ascii="Malgun Gothic" w:hAnsi="Malgun Gothic" w:eastAsia="Malgun Gothic"/>
-          <w:sz w:val="22"/>
-        </w:rPr>
-        <w:t>이 벤치마크도 일부러 좁게 잡았다. 소형주 전략이 거래 가능성을 위해 유동성 상위 90% 안에서 종목을 골랐으므로, 비교 대상도 같은 유니버스를 동일가중으로 보유하게 했다. KOSPI 전체 지수와 비교하면 전략의 유동성 선택 자체가 만든 차이와 신호가 만든 차이를 한꺼번에 비교하게 된다. 그럼에도 이 비교가 규모·가치·수익성·시장 베타를 모두 제거한 요인모형은 아니다. 여기서 말할 수 있는 것은 유동성 유니버스 자체를 산 것만으로는 41.1%를 설명하기 어렵다는 정도다.</w:t>
+        <w:t>수익률 연결도 다시 점검했다. 몇 년 뒤 재관측된 가격을 다음 달 가격으로 연결할 수 있는 공백 21개와 재진입 구간 1,764행은 격리했다. 이 작업은 수익률을 높이기 위한 보정이 아니다. 월말에 고른 종목의 다음 달 수익률만 붙인다는 기본 약속을 지키기 위한 처리다. 이번 글의 모든 핵심 숫자는 이 연결 규칙과 거래정지 필터를 적용한 전체 재계산 결과로 바꿨다.</w:t>
       </w:r>
     </w:p>
     <w:p>

</xml_diff>

<commit_message>
Revalidate part one follow-up checks
</commit_message>
<xml_diff>
--- a/deliverables/문병로_교수의_메트릭_스튜디오_02_01_블로그_게시용_수정본.docx
+++ b/deliverables/문병로_교수의_메트릭_스튜디오_02_01_블로그_게시용_수정본.docx
@@ -2141,6 +2141,54 @@
     </w:p>
     <w:p>
       <w:pPr>
+        <w:spacing w:after="160" w:line="320" w:lineRule="auto"/>
+      </w:pPr>
+      <w:r>
+        <w:rPr>
+          <w:rFonts w:ascii="Malgun Gothic" w:hAnsi="Malgun Gothic" w:eastAsia="Malgun Gothic"/>
+          <w:sz w:val="22"/>
+        </w:rPr>
+        <w:t>거래정지 필터를 넣은 수익률 패널로 시간 분할도 다시 돌렸다. 2000년 8월부터 2013년 12월까지만 보고 가장 높은 t-통계량을 낸 조합을 하나 고른 뒤, 2014년 1월 이후는 선택에 전혀 쓰지 않았다. 선택된 조합은 다시 소형주 50종목·유동성 상위 90%·1억 원·비용 0.5배였다. 이후 149개월의 비용 차감 CAGR은 49.6%, t-통계량은 6.00이었다. 이 숫자는 미래 수익률을 보장하지 않는다. 다만 거래정지 상태를 후보에서 빼자 결과가 사라졌다고 말할 근거도 없었다.</w:t>
+      </w:r>
+    </w:p>
+    <w:p>
+      <w:pPr>
+        <w:spacing w:after="160" w:line="320" w:lineRule="auto"/>
+      </w:pPr>
+      <w:r>
+        <w:rPr>
+          <w:rFonts w:ascii="Malgun Gothic" w:hAnsi="Malgun Gothic" w:eastAsia="Malgun Gothic"/>
+          <w:sz w:val="22"/>
+        </w:rPr>
+        <w:t>한 번의 시점 분할이 우연히 좋았을 가능성도 따로 확인했다. 2008년부터 매년 1월에는 그 전까지의 데이터로 가장 높은 t-통계량 조합 하나만 고르고, 그해 수익률만 이어 붙였다. 이렇게 만든 19년·221개월의 롤링 워크포워드 CAGR은 38.2%, t-통계량은 5.64였다. 해마다 선택된 전략은 두 종류뿐이었다. 이 결과는 전략을 미래에 추천하는 근거가 아니라, 거래정지 필터를 통합한 뒤에도 ‘과거 전체를 보고 최고값 하나를 고른 결과’만은 아니라는 확인이다.</w:t>
+      </w:r>
+    </w:p>
+    <w:p>
+      <w:pPr>
+        <w:spacing w:after="160" w:line="320" w:lineRule="auto"/>
+      </w:pPr>
+      <w:r>
+        <w:rPr>
+          <w:rFonts w:ascii="Malgun Gothic" w:hAnsi="Malgun Gothic" w:eastAsia="Malgun Gothic"/>
+          <w:sz w:val="22"/>
+        </w:rPr>
+        <w:t>비용도 전량 월간 교체라는 단순 가정을 그대로 두지 않았다. 같은 거래정지 필터 아래에서 전월 보유 종목이 가격 변동을 겪은 뒤 목표 비중으로 돌아가기 위해 실제로 얼마나 바뀌는지를 다시 계산했다. 평균 편도 교체율은 39.3%였고, 이 교체율만큼 비용을 적용한 CAGR은 49.1%였다. 매월 종목 전체를 팔고 다시 산다고 둔 기본 계산의 CAGR 46.6%보다 높다. 이것은 전략이 좋아졌다는 발견이 아니라, 전량 교체 가정이 비용을 보수적으로 잡았다는 뜻이다.</w:t>
+      </w:r>
+    </w:p>
+    <w:p>
+      <w:pPr>
+        <w:spacing w:after="160" w:line="320" w:lineRule="auto"/>
+      </w:pPr>
+      <w:r>
+        <w:rPr>
+          <w:rFonts w:ascii="Malgun Gothic" w:hAnsi="Malgun Gothic" w:eastAsia="Malgun Gothic"/>
+          <w:sz w:val="22"/>
+        </w:rPr>
+        <w:t>마지막으로 소형주 50종목 조합을 같은 유동성 상위 90% 유니버스의 동일가중 포트폴리오와 비교했다. 같은 거래정지 필터를 적용한 기준선의 CAGR은 9.3%, 전략의 비용 차감 CAGR은 49.1%였다. 월별 초과수익률의 t-통계량은 6.63이었다. 이 비교로 규모·가치·수익성 같은 요인을 모두 통제한 것은 아니다. 다만 결과가 유동성 상위 90% 종목을 넓게 보유한 효과만으로 설명되는지는 다시 의심해 볼 수 있게 됐다.</w:t>
+      </w:r>
+    </w:p>
+    <w:p>
+      <w:pPr>
         <w:pStyle w:val="Heading2"/>
       </w:pPr>
       <w:r>

</xml_diff>